<commit_message>
Add explainable discovery, verified trade reviews and transaction history
</commit_message>
<xml_diff>
--- a/docs/接口说明.docx
+++ b/docs/接口说明.docx
@@ -1633,7 +1633,7 @@
           </w:tcPr>
           <w:p>
             <w:r>
-              <w:t>kpi、trend（补齐近 7 日）、categories、definition</w:t>
+              <w:t>kpi、from/to（1–90 天），返回累计 kpi、区间 period/trend、categories、definition</w:t>
             </w:r>
           </w:p>
         </w:tc>
@@ -1665,7 +1665,7 @@
           </w:tcPr>
           <w:p>
             <w:r>
-              <w:t>status、q，最多 500 条</w:t>
+              <w:t>status、q、page/size，返回分页</w:t>
             </w:r>
           </w:p>
         </w:tc>
@@ -1729,7 +1729,7 @@
           </w:tcPr>
           <w:p>
             <w:r>
-              <w:t>q 匹配账号/昵称，最多 500 条</w:t>
+              <w:t>q 匹配账号/昵称、page/size，返回分页</w:t>
             </w:r>
           </w:p>
         </w:tc>
@@ -1793,7 +1793,7 @@
           </w:tcPr>
           <w:p>
             <w:r>
-              <w:t>status，最多 500 条</w:t>
+              <w:t>status、page/size，返回分页</w:t>
             </w:r>
           </w:p>
         </w:tc>
@@ -1857,7 +1857,7 @@
           </w:tcPr>
           <w:p>
             <w:r>
-              <w:t>status、buyer、seller、from、to；日期 YYYY-MM-DD，to 含当天，最多 500 条</w:t>
+              <w:t>status、buyer、seller、from、to；日期 YYYY-MM-DD，to 含当天，page/size 返回分页</w:t>
             </w:r>
           </w:p>
         </w:tc>
@@ -1889,7 +1889,7 @@
           </w:tcPr>
           <w:p>
             <w:r>
-              <w:t>最近 200 条操作审计</w:t>
+              <w:t>page/size 分页操作审计</w:t>
             </w:r>
           </w:p>
         </w:tc>
@@ -1897,7 +1897,793 @@
     </w:tbl>
     <w:p>
       <w:r>
-        <w:t>为适合课程规模，个人列表与管理列表使用固定上限或完整个人记录；公共集市实现服务器分页。后续规模扩大应为后台和个人列表补充游标/分页接口。</w:t>
+        <w:t>所有管理列表返回 {items,total,page,size}，默认 20 条，size 1–100、page 1–100000。公共集市、卖家商品/评价、通知也使用服务端分页。个人商品、订单、收藏和举报仍返回完整个人列表，个人留言最多 200 条。</w:t>
+      </w:r>
+    </w:p>
+    <w:p>
+      <w:pPr>
+        <w:pStyle w:val="Heading2"/>
+      </w:pPr>
+      <w:r>
+        <w:t>V1.1 推荐、卖家与评价</w:t>
+      </w:r>
+    </w:p>
+    <w:tbl>
+      <w:tblPr>
+        <w:tblStyle w:val="LightShading-Accent1"/>
+        <w:tblW w:type="auto" w:w="0"/>
+        <w:tblLook w:firstColumn="1" w:firstRow="1" w:lastColumn="0" w:lastRow="0" w:noHBand="0" w:noVBand="1" w:val="04A0"/>
+      </w:tblPr>
+      <w:tblGrid>
+        <w:gridCol w:w="2448"/>
+        <w:gridCol w:w="2448"/>
+        <w:gridCol w:w="2448"/>
+        <w:gridCol w:w="2448"/>
+      </w:tblGrid>
+      <w:tr>
+        <w:tc>
+          <w:tcPr>
+            <w:tcW w:type="dxa" w:w="2448"/>
+          </w:tcPr>
+          <w:p>
+            <w:r>
+              <w:t>方法</w:t>
+            </w:r>
+          </w:p>
+        </w:tc>
+        <w:tc>
+          <w:tcPr>
+            <w:tcW w:type="dxa" w:w="2448"/>
+          </w:tcPr>
+          <w:p>
+            <w:r>
+              <w:t>路径</w:t>
+            </w:r>
+          </w:p>
+        </w:tc>
+        <w:tc>
+          <w:tcPr>
+            <w:tcW w:type="dxa" w:w="2448"/>
+          </w:tcPr>
+          <w:p>
+            <w:r>
+              <w:t>说明</w:t>
+            </w:r>
+          </w:p>
+        </w:tc>
+        <w:tc>
+          <w:tcPr>
+            <w:tcW w:type="dxa" w:w="2448"/>
+          </w:tcPr>
+          <w:p>
+            <w:r>
+              <w:t>权限</w:t>
+            </w:r>
+          </w:p>
+        </w:tc>
+      </w:tr>
+      <w:tr>
+        <w:tc>
+          <w:tcPr>
+            <w:tcW w:type="dxa" w:w="2448"/>
+          </w:tcPr>
+          <w:p>
+            <w:r>
+              <w:t>GET</w:t>
+            </w:r>
+          </w:p>
+        </w:tc>
+        <w:tc>
+          <w:tcPr>
+            <w:tcW w:type="dxa" w:w="2448"/>
+          </w:tcPr>
+          <w:p>
+            <w:r>
+              <w:t>/discovery?size=4</w:t>
+            </w:r>
+          </w:p>
+        </w:tc>
+        <w:tc>
+          <w:tcPr>
+            <w:tcW w:type="dxa" w:w="2448"/>
+          </w:tcPr>
+          <w:p>
+            <w:r>
+              <w:t>size 1–12；recommended/popular/mode/profile/priceCenter/method；推荐含 reason/score_parts/score</w:t>
+            </w:r>
+          </w:p>
+        </w:tc>
+        <w:tc>
+          <w:tcPr>
+            <w:tcW w:type="dxa" w:w="2448"/>
+          </w:tcPr>
+          <w:p>
+            <w:r>
+              <w:t>公开，带令牌时按收藏偏好</w:t>
+            </w:r>
+          </w:p>
+        </w:tc>
+      </w:tr>
+      <w:tr>
+        <w:tc>
+          <w:tcPr>
+            <w:tcW w:type="dxa" w:w="2448"/>
+          </w:tcPr>
+          <w:p>
+            <w:r>
+              <w:t>GET</w:t>
+            </w:r>
+          </w:p>
+        </w:tc>
+        <w:tc>
+          <w:tcPr>
+            <w:tcW w:type="dxa" w:w="2448"/>
+          </w:tcPr>
+          <w:p>
+            <w:r>
+              <w:t>/announcements</w:t>
+            </w:r>
+          </w:p>
+        </w:tc>
+        <w:tc>
+          <w:tcPr>
+            <w:tcW w:type="dxa" w:w="2448"/>
+          </w:tcPr>
+          <w:p>
+            <w:r>
+              <w:t>最近 20 条已发布公告，置顶优先</w:t>
+            </w:r>
+          </w:p>
+        </w:tc>
+        <w:tc>
+          <w:tcPr>
+            <w:tcW w:type="dxa" w:w="2448"/>
+          </w:tcPr>
+          <w:p>
+            <w:r>
+              <w:t>公开</w:t>
+            </w:r>
+          </w:p>
+        </w:tc>
+      </w:tr>
+      <w:tr>
+        <w:tc>
+          <w:tcPr>
+            <w:tcW w:type="dxa" w:w="2448"/>
+          </w:tcPr>
+          <w:p>
+            <w:r>
+              <w:t>GET</w:t>
+            </w:r>
+          </w:p>
+        </w:tc>
+        <w:tc>
+          <w:tcPr>
+            <w:tcW w:type="dxa" w:w="2448"/>
+          </w:tcPr>
+          <w:p>
+            <w:r>
+              <w:t>/sellers/{id}?page=1&amp;size=8</w:t>
+            </w:r>
+          </w:p>
+        </w:tc>
+        <w:tc>
+          <w:tcPr>
+            <w:tcW w:type="dxa" w:w="2448"/>
+          </w:tcPr>
+          <w:p>
+            <w:r>
+              <w:t>profile/stats/goods；goods 为分页</w:t>
+            </w:r>
+          </w:p>
+        </w:tc>
+        <w:tc>
+          <w:tcPr>
+            <w:tcW w:type="dxa" w:w="2448"/>
+          </w:tcPr>
+          <w:p>
+            <w:r>
+              <w:t>正常账号公开</w:t>
+            </w:r>
+          </w:p>
+        </w:tc>
+      </w:tr>
+      <w:tr>
+        <w:tc>
+          <w:tcPr>
+            <w:tcW w:type="dxa" w:w="2448"/>
+          </w:tcPr>
+          <w:p>
+            <w:r>
+              <w:t>GET</w:t>
+            </w:r>
+          </w:p>
+        </w:tc>
+        <w:tc>
+          <w:tcPr>
+            <w:tcW w:type="dxa" w:w="2448"/>
+          </w:tcPr>
+          <w:p>
+            <w:r>
+              <w:t>/sellers/{id}/reviews?page=1&amp;size=10</w:t>
+            </w:r>
+          </w:p>
+        </w:tc>
+        <w:tc>
+          <w:tcPr>
+            <w:tcW w:type="dxa" w:w="2448"/>
+          </w:tcPr>
+          <w:p>
+            <w:r>
+              <w:t>已完成订单评价分页，不返回内部订单号</w:t>
+            </w:r>
+          </w:p>
+        </w:tc>
+        <w:tc>
+          <w:tcPr>
+            <w:tcW w:type="dxa" w:w="2448"/>
+          </w:tcPr>
+          <w:p>
+            <w:r>
+              <w:t>正常账号公开</w:t>
+            </w:r>
+          </w:p>
+        </w:tc>
+      </w:tr>
+      <w:tr>
+        <w:tc>
+          <w:tcPr>
+            <w:tcW w:type="dxa" w:w="2448"/>
+          </w:tcPr>
+          <w:p>
+            <w:r>
+              <w:t>GET</w:t>
+            </w:r>
+          </w:p>
+        </w:tc>
+        <w:tc>
+          <w:tcPr>
+            <w:tcW w:type="dxa" w:w="2448"/>
+          </w:tcPr>
+          <w:p>
+            <w:r>
+              <w:t>/orders/{id}</w:t>
+            </w:r>
+          </w:p>
+        </w:tc>
+        <w:tc>
+          <w:tcPr>
+            <w:tcW w:type="dxa" w:w="2448"/>
+          </w:tcPr>
+          <w:p>
+            <w:r>
+              <w:t>订单、events 事件列表、review 评价列表</w:t>
+            </w:r>
+          </w:p>
+        </w:tc>
+        <w:tc>
+          <w:tcPr>
+            <w:tcW w:type="dxa" w:w="2448"/>
+          </w:tcPr>
+          <w:p>
+            <w:r>
+              <w:t>对应双方或管理员查询</w:t>
+            </w:r>
+          </w:p>
+        </w:tc>
+      </w:tr>
+      <w:tr>
+        <w:tc>
+          <w:tcPr>
+            <w:tcW w:type="dxa" w:w="2448"/>
+          </w:tcPr>
+          <w:p>
+            <w:r>
+              <w:t>POST</w:t>
+            </w:r>
+          </w:p>
+        </w:tc>
+        <w:tc>
+          <w:tcPr>
+            <w:tcW w:type="dxa" w:w="2448"/>
+          </w:tcPr>
+          <w:p>
+            <w:r>
+              <w:t>/orders/{id}/review</w:t>
+            </w:r>
+          </w:p>
+        </w:tc>
+        <w:tc>
+          <w:tcPr>
+            <w:tcW w:type="dxa" w:w="2448"/>
+          </w:tcPr>
+          <w:p>
+            <w:r>
+              <w:t>rating 1–5 整数、content 5–500 字 → id</w:t>
+            </w:r>
+          </w:p>
+        </w:tc>
+        <w:tc>
+          <w:tcPr>
+            <w:tcW w:type="dxa" w:w="2448"/>
+          </w:tcPr>
+          <w:p>
+            <w:r>
+              <w:t>对应已完成订单的买家，一次</w:t>
+            </w:r>
+          </w:p>
+        </w:tc>
+      </w:tr>
+    </w:tbl>
+    <w:p>
+      <w:r>
+        <w:t>推荐字段实际名称为 recommendation_reason、recommendation_score、score_parts。profile 为常收藏类别及数量，favoriteCount 为参与计算的收藏数量。没有偏好时 mode=DISCOVERY，否则 PERSONALIZED。评分细节见完整功能说明；不返回其他用户的收藏明细。</w:t>
+      </w:r>
+    </w:p>
+    <w:p>
+      <w:pPr>
+        <w:pStyle w:val="Heading2"/>
+      </w:pPr>
+      <w:r>
+        <w:t>V1.1 站内通知</w:t>
+      </w:r>
+    </w:p>
+    <w:tbl>
+      <w:tblPr>
+        <w:tblStyle w:val="LightShading-Accent1"/>
+        <w:tblW w:type="auto" w:w="0"/>
+        <w:tblLook w:firstColumn="1" w:firstRow="1" w:lastColumn="0" w:lastRow="0" w:noHBand="0" w:noVBand="1" w:val="04A0"/>
+      </w:tblPr>
+      <w:tblGrid>
+        <w:gridCol w:w="3264"/>
+        <w:gridCol w:w="3264"/>
+        <w:gridCol w:w="3264"/>
+      </w:tblGrid>
+      <w:tr>
+        <w:tc>
+          <w:tcPr>
+            <w:tcW w:type="dxa" w:w="3264"/>
+          </w:tcPr>
+          <w:p>
+            <w:r>
+              <w:t>方法</w:t>
+            </w:r>
+          </w:p>
+        </w:tc>
+        <w:tc>
+          <w:tcPr>
+            <w:tcW w:type="dxa" w:w="3264"/>
+          </w:tcPr>
+          <w:p>
+            <w:r>
+              <w:t>路径</w:t>
+            </w:r>
+          </w:p>
+        </w:tc>
+        <w:tc>
+          <w:tcPr>
+            <w:tcW w:type="dxa" w:w="3264"/>
+          </w:tcPr>
+          <w:p>
+            <w:r>
+              <w:t>说明</w:t>
+            </w:r>
+          </w:p>
+        </w:tc>
+      </w:tr>
+      <w:tr>
+        <w:tc>
+          <w:tcPr>
+            <w:tcW w:type="dxa" w:w="3264"/>
+          </w:tcPr>
+          <w:p>
+            <w:r>
+              <w:t>GET</w:t>
+            </w:r>
+          </w:p>
+        </w:tc>
+        <w:tc>
+          <w:tcPr>
+            <w:tcW w:type="dxa" w:w="3264"/>
+          </w:tcPr>
+          <w:p>
+            <w:r>
+              <w:t>/me/notifications</w:t>
+            </w:r>
+          </w:p>
+        </w:tc>
+        <w:tc>
+          <w:tcPr>
+            <w:tcW w:type="dxa" w:w="3264"/>
+          </w:tcPr>
+          <w:p>
+            <w:r>
+              <w:t>unread=false/true、page/size → items,total,unread,page,size；unread 为该用户全部未读数量</w:t>
+            </w:r>
+          </w:p>
+        </w:tc>
+      </w:tr>
+      <w:tr>
+        <w:tc>
+          <w:tcPr>
+            <w:tcW w:type="dxa" w:w="3264"/>
+          </w:tcPr>
+          <w:p>
+            <w:r>
+              <w:t>POST</w:t>
+            </w:r>
+          </w:p>
+        </w:tc>
+        <w:tc>
+          <w:tcPr>
+            <w:tcW w:type="dxa" w:w="3264"/>
+          </w:tcPr>
+          <w:p>
+            <w:r>
+              <w:t>/me/notifications/{id}/read</w:t>
+            </w:r>
+          </w:p>
+        </w:tc>
+        <w:tc>
+          <w:tcPr>
+            <w:tcW w:type="dxa" w:w="3264"/>
+          </w:tcPr>
+          <w:p>
+            <w:r>
+              <w:t>标为已读；他人 ID 返回 404</w:t>
+            </w:r>
+          </w:p>
+        </w:tc>
+      </w:tr>
+      <w:tr>
+        <w:tc>
+          <w:tcPr>
+            <w:tcW w:type="dxa" w:w="3264"/>
+          </w:tcPr>
+          <w:p>
+            <w:r>
+              <w:t>POST</w:t>
+            </w:r>
+          </w:p>
+        </w:tc>
+        <w:tc>
+          <w:tcPr>
+            <w:tcW w:type="dxa" w:w="3264"/>
+          </w:tcPr>
+          <w:p>
+            <w:r>
+              <w:t>/me/notifications/read-all</w:t>
+            </w:r>
+          </w:p>
+        </w:tc>
+        <w:tc>
+          <w:tcPr>
+            <w:tcW w:type="dxa" w:w="3264"/>
+          </w:tcPr>
+          <w:p>
+            <w:r>
+              <w:t>标记当前账号全部通知已读</w:t>
+            </w:r>
+          </w:p>
+        </w:tc>
+      </w:tr>
+    </w:tbl>
+    <w:p>
+      <w:r>
+        <w:t>全部需要登录。通知内容与跳转路径由后端业务生成，业务与通知同事务提交。</w:t>
+      </w:r>
+    </w:p>
+    <w:p>
+      <w:pPr>
+        <w:pStyle w:val="Heading2"/>
+      </w:pPr>
+      <w:r>
+        <w:t>V1.1 管理配置</w:t>
+      </w:r>
+    </w:p>
+    <w:tbl>
+      <w:tblPr>
+        <w:tblStyle w:val="LightShading-Accent1"/>
+        <w:tblW w:type="auto" w:w="0"/>
+        <w:tblLook w:firstColumn="1" w:firstRow="1" w:lastColumn="0" w:lastRow="0" w:noHBand="0" w:noVBand="1" w:val="04A0"/>
+      </w:tblPr>
+      <w:tblGrid>
+        <w:gridCol w:w="3264"/>
+        <w:gridCol w:w="3264"/>
+        <w:gridCol w:w="3264"/>
+      </w:tblGrid>
+      <w:tr>
+        <w:tc>
+          <w:tcPr>
+            <w:tcW w:type="dxa" w:w="3264"/>
+          </w:tcPr>
+          <w:p>
+            <w:r>
+              <w:t>方法</w:t>
+            </w:r>
+          </w:p>
+        </w:tc>
+        <w:tc>
+          <w:tcPr>
+            <w:tcW w:type="dxa" w:w="3264"/>
+          </w:tcPr>
+          <w:p>
+            <w:r>
+              <w:t>路径</w:t>
+            </w:r>
+          </w:p>
+        </w:tc>
+        <w:tc>
+          <w:tcPr>
+            <w:tcW w:type="dxa" w:w="3264"/>
+          </w:tcPr>
+          <w:p>
+            <w:r>
+              <w:t>说明</w:t>
+            </w:r>
+          </w:p>
+        </w:tc>
+      </w:tr>
+      <w:tr>
+        <w:tc>
+          <w:tcPr>
+            <w:tcW w:type="dxa" w:w="3264"/>
+          </w:tcPr>
+          <w:p>
+            <w:r>
+              <w:t>GET</w:t>
+            </w:r>
+          </w:p>
+        </w:tc>
+        <w:tc>
+          <w:tcPr>
+            <w:tcW w:type="dxa" w:w="3264"/>
+          </w:tcPr>
+          <w:p>
+            <w:r>
+              <w:t>/admin/categories</w:t>
+            </w:r>
+          </w:p>
+        </w:tc>
+        <w:tc>
+          <w:tcPr>
+            <w:tcW w:type="dxa" w:w="3264"/>
+          </w:tcPr>
+          <w:p>
+            <w:r>
+              <w:t>page/size 分页，含关联 goods_count</w:t>
+            </w:r>
+          </w:p>
+        </w:tc>
+      </w:tr>
+      <w:tr>
+        <w:tc>
+          <w:tcPr>
+            <w:tcW w:type="dxa" w:w="3264"/>
+          </w:tcPr>
+          <w:p>
+            <w:r>
+              <w:t>POST</w:t>
+            </w:r>
+          </w:p>
+        </w:tc>
+        <w:tc>
+          <w:tcPr>
+            <w:tcW w:type="dxa" w:w="3264"/>
+          </w:tcPr>
+          <w:p>
+            <w:r>
+              <w:t>/admin/categories</w:t>
+            </w:r>
+          </w:p>
+        </w:tc>
+        <w:tc>
+          <w:tcPr>
+            <w:tcW w:type="dxa" w:w="3264"/>
+          </w:tcPr>
+          <w:p>
+            <w:r>
+              <w:t>name、icon、sortOrder、status → id</w:t>
+            </w:r>
+          </w:p>
+        </w:tc>
+      </w:tr>
+      <w:tr>
+        <w:tc>
+          <w:tcPr>
+            <w:tcW w:type="dxa" w:w="3264"/>
+          </w:tcPr>
+          <w:p>
+            <w:r>
+              <w:t>PUT</w:t>
+            </w:r>
+          </w:p>
+        </w:tc>
+        <w:tc>
+          <w:tcPr>
+            <w:tcW w:type="dxa" w:w="3264"/>
+          </w:tcPr>
+          <w:p>
+            <w:r>
+              <w:t>/admin/categories/{id}</w:t>
+            </w:r>
+          </w:p>
+        </w:tc>
+        <w:tc>
+          <w:tcPr>
+            <w:tcW w:type="dxa" w:w="3264"/>
+          </w:tcPr>
+          <w:p>
+            <w:r>
+              <w:t>同上；停用阻止后续发布，不隐藏既有商品</w:t>
+            </w:r>
+          </w:p>
+        </w:tc>
+      </w:tr>
+      <w:tr>
+        <w:tc>
+          <w:tcPr>
+            <w:tcW w:type="dxa" w:w="3264"/>
+          </w:tcPr>
+          <w:p>
+            <w:r>
+              <w:t>DELETE</w:t>
+            </w:r>
+          </w:p>
+        </w:tc>
+        <w:tc>
+          <w:tcPr>
+            <w:tcW w:type="dxa" w:w="3264"/>
+          </w:tcPr>
+          <w:p>
+            <w:r>
+              <w:t>/admin/categories/{id}</w:t>
+            </w:r>
+          </w:p>
+        </w:tc>
+        <w:tc>
+          <w:tcPr>
+            <w:tcW w:type="dxa" w:w="3264"/>
+          </w:tcPr>
+          <w:p>
+            <w:r>
+              <w:t>无商品引用才能删除，否则 409</w:t>
+            </w:r>
+          </w:p>
+        </w:tc>
+      </w:tr>
+      <w:tr>
+        <w:tc>
+          <w:tcPr>
+            <w:tcW w:type="dxa" w:w="3264"/>
+          </w:tcPr>
+          <w:p>
+            <w:r>
+              <w:t>GET</w:t>
+            </w:r>
+          </w:p>
+        </w:tc>
+        <w:tc>
+          <w:tcPr>
+            <w:tcW w:type="dxa" w:w="3264"/>
+          </w:tcPr>
+          <w:p>
+            <w:r>
+              <w:t>/admin/announcements</w:t>
+            </w:r>
+          </w:p>
+        </w:tc>
+        <w:tc>
+          <w:tcPr>
+            <w:tcW w:type="dxa" w:w="3264"/>
+          </w:tcPr>
+          <w:p>
+            <w:r>
+              <w:t>page/size，含草稿与发布</w:t>
+            </w:r>
+          </w:p>
+        </w:tc>
+      </w:tr>
+      <w:tr>
+        <w:tc>
+          <w:tcPr>
+            <w:tcW w:type="dxa" w:w="3264"/>
+          </w:tcPr>
+          <w:p>
+            <w:r>
+              <w:t>POST</w:t>
+            </w:r>
+          </w:p>
+        </w:tc>
+        <w:tc>
+          <w:tcPr>
+            <w:tcW w:type="dxa" w:w="3264"/>
+          </w:tcPr>
+          <w:p>
+            <w:r>
+              <w:t>/admin/announcements</w:t>
+            </w:r>
+          </w:p>
+        </w:tc>
+        <w:tc>
+          <w:tcPr>
+            <w:tcW w:type="dxa" w:w="3264"/>
+          </w:tcPr>
+          <w:p>
+            <w:r>
+              <w:t>title、content、status、pinned → id</w:t>
+            </w:r>
+          </w:p>
+        </w:tc>
+      </w:tr>
+      <w:tr>
+        <w:tc>
+          <w:tcPr>
+            <w:tcW w:type="dxa" w:w="3264"/>
+          </w:tcPr>
+          <w:p>
+            <w:r>
+              <w:t>PUT</w:t>
+            </w:r>
+          </w:p>
+        </w:tc>
+        <w:tc>
+          <w:tcPr>
+            <w:tcW w:type="dxa" w:w="3264"/>
+          </w:tcPr>
+          <w:p>
+            <w:r>
+              <w:t>/admin/announcements/{id}</w:t>
+            </w:r>
+          </w:p>
+        </w:tc>
+        <w:tc>
+          <w:tcPr>
+            <w:tcW w:type="dxa" w:w="3264"/>
+          </w:tcPr>
+          <w:p>
+            <w:r>
+              <w:t>同上；PUBLISHED 即公开</w:t>
+            </w:r>
+          </w:p>
+        </w:tc>
+      </w:tr>
+      <w:tr>
+        <w:tc>
+          <w:tcPr>
+            <w:tcW w:type="dxa" w:w="3264"/>
+          </w:tcPr>
+          <w:p>
+            <w:r>
+              <w:t>DELETE</w:t>
+            </w:r>
+          </w:p>
+        </w:tc>
+        <w:tc>
+          <w:tcPr>
+            <w:tcW w:type="dxa" w:w="3264"/>
+          </w:tcPr>
+          <w:p>
+            <w:r>
+              <w:t>/admin/announcements/{id}</w:t>
+            </w:r>
+          </w:p>
+        </w:tc>
+        <w:tc>
+          <w:tcPr>
+            <w:tcW w:type="dxa" w:w="3264"/>
+          </w:tcPr>
+          <w:p>
+            <w:r>
+              <w:t>删除并记录日志</w:t>
+            </w:r>
+          </w:p>
+        </w:tc>
+      </w:tr>
+    </w:tbl>
+    <w:p>
+      <w:r>
+        <w:t>分类 name 最多 32 字；icon 为 book/laptop/coffee/bike/shirt/box/camera/leaf；sortOrder 0–9999；status=ACTIVE/INACTIVE。公告 title 最多 80、content 最多 2000 字，status=DRAFT/PUBLISHED，pinned 为布尔值。配置修改全部需要管理员权限并审计。</w:t>
       </w:r>
     </w:p>
     <w:sectPr>

</xml_diff>